<commit_message>
Adding institutes and other
</commit_message>
<xml_diff>
--- a/chm_choice_of_practices/static/templates/practice_agreement_template.docx
+++ b/chm_choice_of_practices/static/templates/practice_agreement_template.docx
@@ -9,14 +9,13 @@
           <w:b/>
         </w:rPr>
       </w:pPr>
-      <w:bookmarkStart w:id="0" w:name="_GoBack"/>
-      <w:bookmarkEnd w:id="0"/>
     </w:p>
     <w:p>
       <w:pPr>
         <w:jc w:val="center"/>
         <w:rPr>
           <w:b/>
+          <w:lang w:val="en-US"/>
         </w:rPr>
       </w:pPr>
       <w:r>
@@ -29,7 +28,37 @@
         <w:rPr>
           <w:b/>
         </w:rPr>
-        <w:t xml:space="preserve"> №___________</w:t>
+        <w:t xml:space="preserve"> №</w:t>
+      </w:r>
+      <w:r>
+        <w:rPr>
+          <w:b/>
+          <w:lang w:val="ru-RU"/>
+        </w:rPr>
+        <w:t>{</w:t>
+      </w:r>
+      <w:r>
+        <w:rPr>
+          <w:b/>
+          <w:lang w:val="en-US"/>
+        </w:rPr>
+        <w:t>{</w:t>
+      </w:r>
+      <w:proofErr w:type="spellStart"/>
+      <w:r>
+        <w:rPr>
+          <w:b/>
+          <w:lang w:val="en-US"/>
+        </w:rPr>
+        <w:t>docs.number</w:t>
+      </w:r>
+      <w:proofErr w:type="spellEnd"/>
+      <w:r>
+        <w:rPr>
+          <w:b/>
+          <w:lang w:val="en-US"/>
+        </w:rPr>
+        <w:t>}}</w:t>
       </w:r>
     </w:p>
     <w:p>
@@ -60,9 +89,6 @@
       </w:pPr>
     </w:p>
     <w:p>
-      <w:pPr>
-        <w:jc w:val="both"/>
-      </w:pPr>
       <w:r>
         <w:t xml:space="preserve">місто </w:t>
       </w:r>
@@ -86,7 +112,112 @@
       </w:r>
       <w:r>
         <w:tab/>
-        <w:t>“______” _________________20___ р.</w:t>
+      </w:r>
+      <w:r>
+        <w:tab/>
+      </w:r>
+      <w:r>
+        <w:tab/>
+      </w:r>
+      <w:r>
+        <w:t>“</w:t>
+      </w:r>
+      <w:r>
+        <w:t>{{</w:t>
+      </w:r>
+      <w:proofErr w:type="spellStart"/>
+      <w:r>
+        <w:t>formatdate</w:t>
+      </w:r>
+      <w:proofErr w:type="spellEnd"/>
+      <w:r>
+        <w:t>(</w:t>
+      </w:r>
+      <w:proofErr w:type="spellStart"/>
+      <w:r>
+        <w:t>docs.date_start</w:t>
+      </w:r>
+      <w:proofErr w:type="spellEnd"/>
+      <w:r>
+        <w:t>, "</w:t>
+      </w:r>
+      <w:proofErr w:type="spellStart"/>
+      <w:r>
+        <w:rPr>
+          <w:lang w:val="en-US"/>
+        </w:rPr>
+        <w:t>dd</w:t>
+      </w:r>
+      <w:proofErr w:type="spellEnd"/>
+      <w:r>
+        <w:t>"</w:t>
+      </w:r>
+      <w:r>
+        <w:t>)}}</w:t>
+      </w:r>
+      <w:r>
+        <w:t xml:space="preserve">” </w:t>
+      </w:r>
+      <w:r>
+        <w:t>{{</w:t>
+      </w:r>
+      <w:proofErr w:type="spellStart"/>
+      <w:r>
+        <w:t>form</w:t>
+      </w:r>
+      <w:r>
+        <w:t>atdate</w:t>
+      </w:r>
+      <w:proofErr w:type="spellEnd"/>
+      <w:r>
+        <w:t>(</w:t>
+      </w:r>
+      <w:proofErr w:type="spellStart"/>
+      <w:r>
+        <w:t>docs.date_start</w:t>
+      </w:r>
+      <w:proofErr w:type="spellEnd"/>
+      <w:r>
+        <w:t xml:space="preserve">, "MMMM" , </w:t>
+      </w:r>
+      <w:proofErr w:type="spellStart"/>
+      <w:r>
+        <w:t>lan</w:t>
+      </w:r>
+      <w:proofErr w:type="spellEnd"/>
+      <w:r>
+        <w:t>g='uk_UA')}}  {{</w:t>
+      </w:r>
+      <w:proofErr w:type="spellStart"/>
+      <w:r>
+        <w:t>form</w:t>
+      </w:r>
+      <w:r>
+        <w:t>atdate</w:t>
+      </w:r>
+      <w:proofErr w:type="spellEnd"/>
+      <w:r>
+        <w:t>(docs.date_s</w:t>
+      </w:r>
+      <w:r>
+        <w:rPr>
+          <w:lang w:val="en-US"/>
+        </w:rPr>
+        <w:t>tart</w:t>
+      </w:r>
+      <w:r>
+        <w:t>, "</w:t>
+      </w:r>
+      <w:proofErr w:type="spellStart"/>
+      <w:r>
+        <w:t>yyyy</w:t>
+      </w:r>
+      <w:proofErr w:type="spellEnd"/>
+      <w:r>
+        <w:t xml:space="preserve">")}} </w:t>
+      </w:r>
+      <w:r>
+        <w:t>р.</w:t>
       </w:r>
     </w:p>
     <w:p/>
@@ -140,8 +271,13 @@
       <w:r>
         <w:t xml:space="preserve"> </w:t>
       </w:r>
-      <w:r>
-        <w:t>Новомлинця Олега Олександровича</w:t>
+      <w:proofErr w:type="spellStart"/>
+      <w:r>
+        <w:t>Новомлинця</w:t>
+      </w:r>
+      <w:proofErr w:type="spellEnd"/>
+      <w:r>
+        <w:t xml:space="preserve"> Олега Олександровича</w:t>
       </w:r>
       <w:r>
         <w:t>,</w:t>
@@ -177,47 +313,55 @@
         <w:t>і, з другої сторони,</w:t>
       </w:r>
       <w:r>
-        <w:t xml:space="preserve"> </w:t>
-      </w:r>
-      <w:r>
-        <w:t>_________________</w:t>
-      </w:r>
-      <w:r>
-        <w:t>________</w:t>
+        <w:t xml:space="preserve"> {{</w:t>
+      </w:r>
+      <w:r>
+        <w:rPr>
+          <w:lang w:val="en-US"/>
+        </w:rPr>
+        <w:t>docs</w:t>
+      </w:r>
+      <w:r>
+        <w:t>.</w:t>
+      </w:r>
+      <w:r>
+        <w:rPr>
+          <w:lang w:val="en-US"/>
+        </w:rPr>
+        <w:t>enterprises</w:t>
+      </w:r>
+      <w:r>
+        <w:t>_</w:t>
+      </w:r>
+      <w:r>
+        <w:rPr>
+          <w:lang w:val="en-US"/>
+        </w:rPr>
+        <w:t>id</w:t>
+      </w:r>
+      <w:r>
+        <w:t>.</w:t>
+      </w:r>
+      <w:r>
+        <w:rPr>
+          <w:lang w:val="en-US"/>
+        </w:rPr>
+        <w:t>name</w:t>
+      </w:r>
+      <w:r>
+        <w:t>}}</w:t>
       </w:r>
     </w:p>
     <w:p>
       <w:pPr>
         <w:jc w:val="both"/>
-      </w:pPr>
-      <w:r>
-        <w:t>____________________________________</w:t>
-      </w:r>
-      <w:r>
-        <w:t>___________________________________</w:t>
-      </w:r>
-      <w:r>
-        <w:t>_________</w:t>
-      </w:r>
-    </w:p>
-    <w:p>
-      <w:pPr>
-        <w:jc w:val="center"/>
         <w:rPr>
           <w:vertAlign w:val="superscript"/>
         </w:rPr>
       </w:pPr>
       <w:r>
-        <w:rPr>
-          <w:vertAlign w:val="superscript"/>
-        </w:rPr>
-        <w:t>(назва підприємства, організації, установи)</w:t>
-      </w:r>
-    </w:p>
-    <w:p>
-      <w:pPr>
-        <w:jc w:val="both"/>
-      </w:pPr>
+        <w:t xml:space="preserve"> </w:t>
+      </w:r>
       <w:r>
         <w:t>(</w:t>
       </w:r>
@@ -231,78 +375,64 @@
         <w:t>база практики</w:t>
       </w:r>
       <w:r>
-        <w:t>), в особі ______</w:t>
-      </w:r>
-      <w:r>
-        <w:t>___</w:t>
-      </w:r>
-      <w:r>
-        <w:t>_____________________________________________</w:t>
-      </w:r>
-    </w:p>
-    <w:p>
-      <w:pPr>
-        <w:ind w:left="3696" w:firstLine="1260"/>
-      </w:pPr>
+        <w:t xml:space="preserve">), в особі </w:t>
+      </w:r>
+      <w:r>
+        <w:t>{{</w:t>
+      </w:r>
       <w:r>
         <w:rPr>
-          <w:vertAlign w:val="superscript"/>
+          <w:lang w:val="en-US"/>
         </w:rPr>
-        <w:t>(посада,</w:t>
+        <w:t>docs</w:t>
+      </w:r>
+      <w:r>
+        <w:t>.</w:t>
       </w:r>
       <w:r>
         <w:rPr>
-          <w:vertAlign w:val="superscript"/>
+          <w:lang w:val="en-US"/>
         </w:rPr>
-        <w:t xml:space="preserve"> прізвище та ініціали)</w:t>
-      </w:r>
-    </w:p>
-    <w:p>
-      <w:pPr>
-        <w:jc w:val="both"/>
-      </w:pPr>
-      <w:r>
-        <w:t>_____________________________________________________________</w:t>
-      </w:r>
-      <w:r>
-        <w:t>__</w:t>
+        <w:t>enterprises</w:t>
       </w:r>
       <w:r>
         <w:t>_</w:t>
       </w:r>
       <w:r>
-        <w:t>, що</w:t>
-      </w:r>
-      <w:r>
-        <w:t xml:space="preserve"> ді</w:t>
-      </w:r>
-      <w:r>
-        <w:t>є</w:t>
-      </w:r>
-      <w:r>
-        <w:t xml:space="preserve"> на підставі</w:t>
-      </w:r>
-    </w:p>
-    <w:p>
-      <w:pPr>
-        <w:jc w:val="both"/>
-      </w:pPr>
-      <w:r>
-        <w:t>________________________________________________________________________________</w:t>
-      </w:r>
-    </w:p>
-    <w:p>
-      <w:pPr>
-        <w:jc w:val="center"/>
         <w:rPr>
-          <w:vertAlign w:val="superscript"/>
+          <w:lang w:val="en-US"/>
         </w:rPr>
-      </w:pPr>
+        <w:t>id</w:t>
+      </w:r>
+      <w:r>
+        <w:t>.</w:t>
+      </w:r>
       <w:r>
         <w:rPr>
-          <w:vertAlign w:val="superscript"/>
+          <w:lang w:val="en-US"/>
         </w:rPr>
-        <w:t>(статут підприємства, розпорядження, доручення)</w:t>
+        <w:t>partner</w:t>
+      </w:r>
+      <w:r>
+        <w:t>_</w:t>
+      </w:r>
+      <w:r>
+        <w:rPr>
+          <w:lang w:val="en-US"/>
+        </w:rPr>
+        <w:t>id</w:t>
+      </w:r>
+      <w:r>
+        <w:t>.</w:t>
+      </w:r>
+      <w:r>
+        <w:rPr>
+          <w:lang w:val="en-US"/>
+        </w:rPr>
+        <w:t>name</w:t>
+      </w:r>
+      <w:r>
+        <w:t xml:space="preserve"> }}</w:t>
       </w:r>
     </w:p>
     <w:p>
@@ -334,19 +464,29 @@
         </w:numPr>
       </w:pPr>
       <w:r>
-        <w:t>База практики зобо</w:t>
+        <w:t xml:space="preserve">База практики </w:t>
+      </w:r>
+      <w:proofErr w:type="spellStart"/>
+      <w:r>
+        <w:t>зобо</w:t>
       </w:r>
       <w:r>
         <w:t>в</w:t>
       </w:r>
+      <w:proofErr w:type="spellEnd"/>
       <w:r>
         <w:rPr>
           <w:lang w:val="en-US"/>
         </w:rPr>
         <w:t>’</w:t>
       </w:r>
-      <w:r>
-        <w:t>язується:</w:t>
+      <w:proofErr w:type="spellStart"/>
+      <w:r>
+        <w:t>язується</w:t>
+      </w:r>
+      <w:proofErr w:type="spellEnd"/>
+      <w:r>
+        <w:t>:</w:t>
       </w:r>
     </w:p>
     <w:p>
@@ -379,21 +519,15 @@
         <w:tblLook w:val="0000" w:firstRow="0" w:lastRow="0" w:firstColumn="0" w:lastColumn="0" w:noHBand="0" w:noVBand="0"/>
       </w:tblPr>
       <w:tblGrid>
-        <w:gridCol w:w="566"/>
-        <w:gridCol w:w="2674"/>
-        <w:gridCol w:w="1013"/>
-        <w:gridCol w:w="1396"/>
-        <w:gridCol w:w="1397"/>
-        <w:gridCol w:w="1350"/>
-        <w:gridCol w:w="1324"/>
+        <w:gridCol w:w="465"/>
+        <w:gridCol w:w="2709"/>
+        <w:gridCol w:w="654"/>
+        <w:gridCol w:w="1963"/>
+        <w:gridCol w:w="1860"/>
+        <w:gridCol w:w="922"/>
+        <w:gridCol w:w="1173"/>
       </w:tblGrid>
       <w:tr>
-        <w:tblPrEx>
-          <w:tblCellMar>
-            <w:top w:w="0" w:type="dxa"/>
-            <w:bottom w:w="0" w:type="dxa"/>
-          </w:tblCellMar>
-        </w:tblPrEx>
         <w:trPr>
           <w:cantSplit/>
         </w:trPr>
@@ -505,12 +639,6 @@
         </w:tc>
       </w:tr>
       <w:tr>
-        <w:tblPrEx>
-          <w:tblCellMar>
-            <w:top w:w="0" w:type="dxa"/>
-            <w:bottom w:w="0" w:type="dxa"/>
-          </w:tblCellMar>
-        </w:tblPrEx>
         <w:trPr>
           <w:cantSplit/>
         </w:trPr>
@@ -603,12 +731,6 @@
         </w:tc>
       </w:tr>
       <w:tr>
-        <w:tblPrEx>
-          <w:tblCellMar>
-            <w:top w:w="0" w:type="dxa"/>
-            <w:bottom w:w="0" w:type="dxa"/>
-          </w:tblCellMar>
-        </w:tblPrEx>
         <w:tc>
           <w:tcPr>
             <w:tcW w:w="566" w:type="dxa"/>
@@ -619,7 +741,31 @@
           <w:tcPr>
             <w:tcW w:w="2674" w:type="dxa"/>
           </w:tcPr>
-          <w:p/>
+          <w:p>
+            <w:pPr>
+              <w:rPr>
+                <w:lang w:val="en-US"/>
+              </w:rPr>
+            </w:pPr>
+            <w:r>
+              <w:rPr>
+                <w:lang w:val="en-US"/>
+              </w:rPr>
+              <w:t>{{docs.</w:t>
+            </w:r>
+            <w:r>
+              <w:rPr>
+                <w:lang w:val="en-US"/>
+              </w:rPr>
+              <w:t>enterprises_id</w:t>
+            </w:r>
+            <w:r>
+              <w:rPr>
+                <w:lang w:val="en-US"/>
+              </w:rPr>
+              <w:t>.name}}</w:t>
+            </w:r>
+          </w:p>
         </w:tc>
         <w:tc>
           <w:tcPr>
@@ -631,19 +777,98 @@
           <w:tcPr>
             <w:tcW w:w="1396" w:type="dxa"/>
           </w:tcPr>
-          <w:p/>
+          <w:p>
+            <w:pPr>
+              <w:rPr>
+                <w:lang w:val="en-US"/>
+              </w:rPr>
+            </w:pPr>
+            <w:r>
+              <w:rPr>
+                <w:lang w:val="en-US"/>
+              </w:rPr>
+              <w:t>{{</w:t>
+            </w:r>
+            <w:proofErr w:type="spellStart"/>
+            <w:r>
+              <w:rPr>
+                <w:lang w:val="en-US"/>
+              </w:rPr>
+              <w:t>docs.</w:t>
+            </w:r>
+            <w:r>
+              <w:rPr>
+                <w:lang w:val="en-US"/>
+              </w:rPr>
+              <w:t>practice_type</w:t>
+            </w:r>
+            <w:proofErr w:type="spellEnd"/>
+            <w:r>
+              <w:rPr>
+                <w:lang w:val="en-US"/>
+              </w:rPr>
+              <w:t xml:space="preserve"> </w:t>
+            </w:r>
+            <w:r>
+              <w:rPr>
+                <w:lang w:val="en-US"/>
+              </w:rPr>
+              <w:t>}}</w:t>
+            </w:r>
+          </w:p>
         </w:tc>
         <w:tc>
           <w:tcPr>
             <w:tcW w:w="1397" w:type="dxa"/>
           </w:tcPr>
-          <w:p/>
+          <w:p>
+            <w:pPr>
+              <w:rPr>
+                <w:lang w:val="en-US"/>
+              </w:rPr>
+            </w:pPr>
+            <w:r>
+              <w:rPr>
+                <w:lang w:val="en-US"/>
+              </w:rPr>
+              <w:t>{{</w:t>
+            </w:r>
+            <w:proofErr w:type="spellStart"/>
+            <w:r>
+              <w:rPr>
+                <w:lang w:val="en-US"/>
+              </w:rPr>
+              <w:t>docs.</w:t>
+            </w:r>
+            <w:r>
+              <w:rPr>
+                <w:lang w:val="en-US"/>
+              </w:rPr>
+              <w:t>places_limit</w:t>
+            </w:r>
+            <w:proofErr w:type="spellEnd"/>
+            <w:r>
+              <w:rPr>
+                <w:lang w:val="en-US"/>
+              </w:rPr>
+              <w:t xml:space="preserve"> </w:t>
+            </w:r>
+            <w:r>
+              <w:rPr>
+                <w:lang w:val="en-US"/>
+              </w:rPr>
+              <w:t>}}</w:t>
+            </w:r>
+          </w:p>
         </w:tc>
         <w:tc>
           <w:tcPr>
             <w:tcW w:w="1350" w:type="dxa"/>
           </w:tcPr>
-          <w:p/>
+          <w:p>
+            <w:bookmarkStart w:id="0" w:name="_GoBack"/>
+            <w:bookmarkEnd w:id="0"/>
+          </w:p>
         </w:tc>
         <w:tc>
           <w:tcPr>
@@ -653,12 +878,6 @@
         </w:tc>
       </w:tr>
       <w:tr>
-        <w:tblPrEx>
-          <w:tblCellMar>
-            <w:top w:w="0" w:type="dxa"/>
-            <w:bottom w:w="0" w:type="dxa"/>
-          </w:tblCellMar>
-        </w:tblPrEx>
         <w:tc>
           <w:tcPr>
             <w:tcW w:w="566" w:type="dxa"/>
@@ -703,12 +922,6 @@
         </w:tc>
       </w:tr>
       <w:tr>
-        <w:tblPrEx>
-          <w:tblCellMar>
-            <w:top w:w="0" w:type="dxa"/>
-            <w:bottom w:w="0" w:type="dxa"/>
-          </w:tblCellMar>
-        </w:tblPrEx>
         <w:tc>
           <w:tcPr>
             <w:tcW w:w="566" w:type="dxa"/>
@@ -753,12 +966,6 @@
         </w:tc>
       </w:tr>
       <w:tr>
-        <w:tblPrEx>
-          <w:tblCellMar>
-            <w:top w:w="0" w:type="dxa"/>
-            <w:bottom w:w="0" w:type="dxa"/>
-          </w:tblCellMar>
-        </w:tblPrEx>
         <w:tc>
           <w:tcPr>
             <w:tcW w:w="566" w:type="dxa"/>
@@ -803,12 +1010,6 @@
         </w:tc>
       </w:tr>
       <w:tr>
-        <w:tblPrEx>
-          <w:tblCellMar>
-            <w:top w:w="0" w:type="dxa"/>
-            <w:bottom w:w="0" w:type="dxa"/>
-          </w:tblCellMar>
-        </w:tblPrEx>
         <w:tc>
           <w:tcPr>
             <w:tcW w:w="566" w:type="dxa"/>
@@ -853,12 +1054,6 @@
         </w:tc>
       </w:tr>
       <w:tr>
-        <w:tblPrEx>
-          <w:tblCellMar>
-            <w:top w:w="0" w:type="dxa"/>
-            <w:bottom w:w="0" w:type="dxa"/>
-          </w:tblCellMar>
-        </w:tblPrEx>
         <w:tc>
           <w:tcPr>
             <w:tcW w:w="566" w:type="dxa"/>
@@ -903,12 +1098,6 @@
         </w:tc>
       </w:tr>
       <w:tr>
-        <w:tblPrEx>
-          <w:tblCellMar>
-            <w:top w:w="0" w:type="dxa"/>
-            <w:bottom w:w="0" w:type="dxa"/>
-          </w:tblCellMar>
-        </w:tblPrEx>
         <w:tc>
           <w:tcPr>
             <w:tcW w:w="566" w:type="dxa"/>
@@ -953,12 +1142,6 @@
         </w:tc>
       </w:tr>
       <w:tr>
-        <w:tblPrEx>
-          <w:tblCellMar>
-            <w:top w:w="0" w:type="dxa"/>
-            <w:bottom w:w="0" w:type="dxa"/>
-          </w:tblCellMar>
-        </w:tblPrEx>
         <w:tc>
           <w:tcPr>
             <w:tcW w:w="566" w:type="dxa"/>
@@ -1003,12 +1186,6 @@
         </w:tc>
       </w:tr>
       <w:tr>
-        <w:tblPrEx>
-          <w:tblCellMar>
-            <w:top w:w="0" w:type="dxa"/>
-            <w:bottom w:w="0" w:type="dxa"/>
-          </w:tblCellMar>
-        </w:tblPrEx>
         <w:tc>
           <w:tcPr>
             <w:tcW w:w="566" w:type="dxa"/>
@@ -1053,12 +1230,6 @@
         </w:tc>
       </w:tr>
       <w:tr>
-        <w:tblPrEx>
-          <w:tblCellMar>
-            <w:top w:w="0" w:type="dxa"/>
-            <w:bottom w:w="0" w:type="dxa"/>
-          </w:tblCellMar>
-        </w:tblPrEx>
         <w:tc>
           <w:tcPr>
             <w:tcW w:w="566" w:type="dxa"/>
@@ -1169,16 +1340,26 @@
         <w:t xml:space="preserve"> умови безпечної роботи на кожному</w:t>
       </w:r>
       <w:r>
-        <w:t xml:space="preserve"> робочому місці. Проводити обов</w:t>
-      </w:r>
+        <w:t xml:space="preserve"> робочому місці. Проводити </w:t>
+      </w:r>
+      <w:proofErr w:type="spellStart"/>
+      <w:r>
+        <w:t>обов</w:t>
+      </w:r>
+      <w:proofErr w:type="spellEnd"/>
       <w:r>
         <w:rPr>
           <w:lang w:val="ru-RU"/>
         </w:rPr>
         <w:t>’</w:t>
       </w:r>
-      <w:r>
-        <w:t>язкові інструктажі з охорони праці: ввідний та на робочому місці. У</w:t>
+      <w:proofErr w:type="spellStart"/>
+      <w:r>
+        <w:t>язкові</w:t>
+      </w:r>
+      <w:proofErr w:type="spellEnd"/>
+      <w:r>
+        <w:t xml:space="preserve"> інструктажі з охорони праці: ввідний та на робочому місці. У</w:t>
       </w:r>
       <w:r>
         <w:t xml:space="preserve"> разі  потреби навчати здобувачів вищої освіти</w:t>
@@ -1295,7 +1476,6 @@
         <w:jc w:val="both"/>
       </w:pPr>
       <w:r>
-        <w:lastRenderedPageBreak/>
         <w:t>Додаткові умови __________________________________________________________</w:t>
       </w:r>
     </w:p>
@@ -1317,16 +1497,26 @@
         <w:jc w:val="both"/>
       </w:pPr>
       <w:r>
-        <w:t>Заклад вищої освіти зобов</w:t>
-      </w:r>
+        <w:t xml:space="preserve">Заклад вищої освіти </w:t>
+      </w:r>
+      <w:proofErr w:type="spellStart"/>
+      <w:r>
+        <w:t>зобов</w:t>
+      </w:r>
+      <w:proofErr w:type="spellEnd"/>
       <w:r>
         <w:rPr>
           <w:lang w:val="en-US"/>
         </w:rPr>
         <w:t>’</w:t>
       </w:r>
-      <w:r>
-        <w:t>язується:</w:t>
+      <w:proofErr w:type="spellStart"/>
+      <w:r>
+        <w:t>язується</w:t>
+      </w:r>
+      <w:proofErr w:type="spellEnd"/>
+      <w:r>
+        <w:t>:</w:t>
       </w:r>
     </w:p>
     <w:p>
@@ -1343,6 +1533,7 @@
         <w:jc w:val="both"/>
       </w:pPr>
       <w:r>
+        <w:lastRenderedPageBreak/>
         <w:t xml:space="preserve">Ознайомити базу практики з програмою практики через </w:t>
       </w:r>
       <w:r>
@@ -1469,16 +1660,26 @@
         <w:t>Сторони відповідають за нев</w:t>
       </w:r>
       <w:r>
-        <w:t>иконання покладених на них обов</w:t>
-      </w:r>
+        <w:t xml:space="preserve">иконання покладених на них </w:t>
+      </w:r>
+      <w:proofErr w:type="spellStart"/>
+      <w:r>
+        <w:t>обов</w:t>
+      </w:r>
+      <w:proofErr w:type="spellEnd"/>
       <w:r>
         <w:rPr>
           <w:lang w:val="ru-RU"/>
         </w:rPr>
         <w:t>’</w:t>
       </w:r>
-      <w:r>
-        <w:t>язків щодо організації і проведення практики згідно з законодавством про працю  України.</w:t>
+      <w:proofErr w:type="spellStart"/>
+      <w:r>
+        <w:t>язків</w:t>
+      </w:r>
+      <w:proofErr w:type="spellEnd"/>
+      <w:r>
+        <w:t xml:space="preserve"> щодо організації і проведення практики згідно з законодавством про працю  України.</w:t>
       </w:r>
     </w:p>
     <w:p>
@@ -1692,12 +1893,6 @@
         <w:gridCol w:w="4927"/>
       </w:tblGrid>
       <w:tr>
-        <w:tblPrEx>
-          <w:tblCellMar>
-            <w:top w:w="0" w:type="dxa"/>
-            <w:bottom w:w="0" w:type="dxa"/>
-          </w:tblCellMar>
-        </w:tblPrEx>
         <w:tc>
           <w:tcPr>
             <w:tcW w:w="4927" w:type="dxa"/>
@@ -1709,33 +1904,45 @@
                 <w:bCs/>
               </w:rPr>
             </w:pPr>
+            <w:proofErr w:type="spellStart"/>
             <w:r>
               <w:rPr>
                 <w:b/>
                 <w:bCs/>
                 <w:lang w:val="ru-RU"/>
               </w:rPr>
-              <w:t>В.о. р</w:t>
-            </w:r>
+              <w:t>В.о</w:t>
+            </w:r>
+            <w:proofErr w:type="spellEnd"/>
             <w:r>
               <w:rPr>
                 <w:b/>
                 <w:bCs/>
-              </w:rPr>
-              <w:t>ектор</w:t>
-            </w:r>
+                <w:lang w:val="ru-RU"/>
+              </w:rPr>
+              <w:t>. р</w:t>
+            </w:r>
+            <w:proofErr w:type="spellStart"/>
             <w:r>
               <w:rPr>
                 <w:b/>
                 <w:bCs/>
               </w:rPr>
-              <w:t>а</w:t>
+              <w:t>ектор</w:t>
             </w:r>
             <w:r>
               <w:rPr>
                 <w:b/>
                 <w:bCs/>
               </w:rPr>
+              <w:t>а</w:t>
+            </w:r>
+            <w:proofErr w:type="spellEnd"/>
+            <w:r>
+              <w:rPr>
+                <w:b/>
+                <w:bCs/>
+              </w:rPr>
               <w:t xml:space="preserve"> </w:t>
             </w:r>
           </w:p>
@@ -1751,11 +1958,6 @@
           </w:p>
           <w:p/>
           <w:p>
-            <w:pPr>
-              <w:rPr>
-                <w:lang w:val="ru-RU"/>
-              </w:rPr>
-            </w:pPr>
             <w:r>
               <w:t>______</w:t>
             </w:r>
@@ -1768,7 +1970,6 @@
             <w:r>
               <w:rPr>
                 <w:u w:val="single"/>
-                <w:lang w:val="ru-RU"/>
               </w:rPr>
               <w:t>Олег НОВОМЛИНЕЦЬ</w:t>
             </w:r>
@@ -2482,11 +2683,15 @@
   </w:style>
   <w:style w:type="character" w:default="1" w:styleId="a0">
     <w:name w:val="Default Paragraph Font"/>
+    <w:uiPriority w:val="1"/>
     <w:semiHidden/>
+    <w:unhideWhenUsed/>
   </w:style>
   <w:style w:type="table" w:default="1" w:styleId="a1">
     <w:name w:val="Normal Table"/>
+    <w:uiPriority w:val="99"/>
     <w:semiHidden/>
+    <w:unhideWhenUsed/>
     <w:tblPr>
       <w:tblInd w:w="0" w:type="dxa"/>
       <w:tblCellMar>
@@ -2499,7 +2704,9 @@
   </w:style>
   <w:style w:type="numbering" w:default="1" w:styleId="a2">
     <w:name w:val="No List"/>
+    <w:uiPriority w:val="99"/>
     <w:semiHidden/>
+    <w:unhideWhenUsed/>
   </w:style>
   <w:style w:type="paragraph" w:customStyle="1" w:styleId="FR2">
     <w:name w:val="FR2"/>
@@ -2768,11 +2975,15 @@
   </w:style>
   <w:style w:type="character" w:default="1" w:styleId="a0">
     <w:name w:val="Default Paragraph Font"/>
+    <w:uiPriority w:val="1"/>
     <w:semiHidden/>
+    <w:unhideWhenUsed/>
   </w:style>
   <w:style w:type="table" w:default="1" w:styleId="a1">
     <w:name w:val="Normal Table"/>
+    <w:uiPriority w:val="99"/>
     <w:semiHidden/>
+    <w:unhideWhenUsed/>
     <w:tblPr>
       <w:tblInd w:w="0" w:type="dxa"/>
       <w:tblCellMar>
@@ -2785,7 +2996,9 @@
   </w:style>
   <w:style w:type="numbering" w:default="1" w:styleId="a2">
     <w:name w:val="No List"/>
+    <w:uiPriority w:val="99"/>
     <w:semiHidden/>
+    <w:unhideWhenUsed/>
   </w:style>
   <w:style w:type="paragraph" w:customStyle="1" w:styleId="FR2">
     <w:name w:val="FR2"/>

</xml_diff>